<commit_message>
feat(quick-report): programmatic cbm defect analysis and recommendations
- add pure-domain cbm defect analysis & recommendation rule engine
- add dynamic CBM_PHRASE_REGISTRY for fp/lvdb, swg, tx, batt, bbox
- gate airborne ultrasound pd prose on technology or anomalous char
- anchor tx rules strictly to engr column K (hv/lv) and column Q tokens
- prioritize master droplist tokens over feeder tags for fp/lvdb
- replace static text with jinja2 placeholders across 10 templates
- add overview status table cell shading (EE0000/00B050)
- bump version to v1.18.0

closes #12, #13, #14, #16
</commit_message>
<xml_diff>
--- a/templates/QUICK REPORT/DEFECT IR US TEV/fp-individual-defect.docx
+++ b/templates/QUICK REPORT/DEFECT IR US TEV/fp-individual-defect.docx
@@ -5206,22 +5206,19 @@
             </w:pPr>
             <w:r>
               <w:rPr>
-                <w:rFonts w:cstheme="minorHAnsi"/>
-                <w:b/>
-                <w:i/>
-              </w:rPr>
-              <w:lastRenderedPageBreak/>
+                <w:b/>
+              </w:rPr>
               <w:t xml:space="preserve">Analysis: </w:t>
             </w:r>
             <w:r>
               <w:rPr>
-                <w:rFonts w:cstheme="minorHAnsi"/>
+                <w:b w:val="0"/>
               </w:rPr>
               <w:t xml:space="preserve"> </w:t>
             </w:r>
             <w:r>
               <w:rPr>
-                <w:rFonts w:cstheme="minorHAnsi"/>
+                <w:b w:val="0"/>
               </w:rPr>
               <w:t>{{ analysis }}</w:t>
             </w:r>
@@ -5252,27 +5249,19 @@
             </w:pPr>
             <w:r>
               <w:rPr>
-                <w:rFonts w:cstheme="minorHAnsi"/>
-                <w:b/>
-                <w:i/>
-                <w:noProof/>
-                <w:lang w:val="en-US"/>
+                <w:b/>
               </w:rPr>
               <w:t xml:space="preserve">Recommendation: </w:t>
             </w:r>
             <w:r>
               <w:rPr>
-                <w:rFonts w:cstheme="minorHAnsi"/>
-                <w:noProof/>
-                <w:lang w:val="en-US"/>
+                <w:b w:val="0"/>
               </w:rPr>
               <w:t xml:space="preserve"> </w:t>
             </w:r>
             <w:r>
               <w:rPr>
-                <w:rFonts w:cstheme="minorHAnsi"/>
-                <w:noProof/>
-                <w:lang w:val="en-US"/>
+                <w:b w:val="0"/>
               </w:rPr>
               <w:t>{{ recommendation }}</w:t>
             </w:r>

</xml_diff>